<commit_message>
Aggiunge la città di Catia Massai
Co-Authored-By: Claude Opus 5.5 <noreply@anthropic.com>
Claude-Session: https://claude.ai/code/session_0148bZgqQiCtdshijf84M1Qp
</commit_message>
<xml_diff>
--- a/testi-critici/artisti/catia-massai/word/presentazione.docx
+++ b/testi-critici/artisti/catia-massai/word/presentazione.docx
@@ -65,6 +65,16 @@
           <w:bottom w:val="single" w:sz="6" w:space="4" w:color="C9A227"/>
         </w:pBdr>
       </w:pPr>
+      <w:r>
+        <w:rPr>
+          <w:rFonts w:ascii="Garamond" w:hAnsi="Garamond" w:eastAsia="Garamond"/>
+          <w:b w:val="0"/>
+          <w:i/>
+          <w:color w:val="6B645B"/>
+          <w:sz w:val="22"/>
+        </w:rPr>
+        <w:t>vive e lavora a Prato</w:t>
+      </w:r>
     </w:p>
     <w:p>
       <w:pPr>

</xml_diff>